<commit_message>
Add technical figures and MongoDB documentation
</commit_message>
<xml_diff>
--- a/documentation/FMA_Capstone_Code_Documentation_Julian_Devonish.docx
+++ b/documentation/FMA_Capstone_Code_Documentation_Julian_Devonish.docx
@@ -1955,6 +1955,36 @@
           <w:sz w:val="21"/>
         </w:rPr>
         <w:t>These two notebooks should be treated as the final evidence notebooks. Notebook 49 shows performance within the FMA test split. Notebook 50 shows the harder external-audio case. The difference between them is important because it defines the model as a ranked review tool rather than an automatic final genre tagger.</w:t>
+      </w:r>
+    </w:p>
+    <w:p>
+      <w:pPr>
+        <w:pStyle w:val="Heading1"/>
+      </w:pPr>
+      <w:r>
+        <w:rPr>
+          <w:rFonts w:ascii="Arial" w:hAnsi="Arial"/>
+          <w:color w:val="0B3D3A"/>
+        </w:rPr>
+        <w:t>MongoDB Implementation Note</w:t>
+      </w:r>
+    </w:p>
+    <w:p>
+      <w:r>
+        <w:rPr>
+          <w:rFonts w:ascii="Arial" w:hAnsi="Arial"/>
+          <w:sz w:val="21"/>
+        </w:rPr>
+        <w:t>MongoDB was implemented in Notebook 04 and expanded in Notebook 25 as the metadata and label-management layer for the project. The local fma_capstone database contained genres_lookup with 163 genre records and tracks_multilabel with 81,574 track documents.</w:t>
+      </w:r>
+    </w:p>
+    <w:p>
+      <w:r>
+        <w:rPr>
+          <w:rFonts w:ascii="Arial" w:hAnsi="Arial"/>
+          <w:sz w:val="21"/>
+        </w:rPr>
+        <w:t>The later modelling and Streamlit app did not query MongoDB live because repeated model training and audio inference were already constrained by local CPU, memory, and disk I/O. Exported CSV, JSON, NumPy, and model files were used for stable reruns and easier submission review. In a production version, MongoDB would be used to retrieve track metadata, maintain the genre hierarchy, store candidate and rare-tail flags, and save prediction results for reviewer search and audit.</w:t>
       </w:r>
     </w:p>
     <w:p>

</xml_diff>